<commit_message>
Add bootstrap confidence intervals + INSUFFICIENT_DATA status; fixes small-sample false-positive rate found in Volume 3's documented 10k-event floor
</commit_message>
<xml_diff>
--- a/docs/volumes/MRFS-Vol1-Standard-Overview.docx
+++ b/docs/volumes/MRFS-Vol1-Standard-Overview.docx
@@ -94,7 +94,7 @@
         <w:spacing w:after="200"/>
       </w:pPr>
       <w:r>
-        <w:t xml:space="preserve">Academic research has established methods for measuring exposure fairness in ranked retrieval — most notably the NIST TREC Fair Ranking Track and the Attention-Weighted Rank Fairness (AWRF) metric, which quantify whether visibility across ranked results matches a fair target distribution. Separately, NIST's AI Risk Management Framework (AI RMF) provides general-purpose governance guidance for AI systems across the Govern, Map, Measure, and Manage functions.</w:t>
+        <w:t xml:space="preserve">Academic research has established methods for measuring exposure fairness in ranked retrieval — most notably the NIST TREC Fair Ranking Track and the Attention-Weighted Rank Fairness (AWRF) metric [1][2], which quantify whether visibility across ranked results matches a fair target distribution. Separately, NIST's AI Risk Management Framework (AI RMF) [3] provides general-purpose governance guidance for AI systems across the Govern, Map, Measure, and Manage functions.</w:t>
       </w:r>
     </w:p>
     <w:p>
@@ -122,7 +122,7 @@
         <w:spacing w:after="200"/>
       </w:pPr>
       <w:r>
-        <w:t xml:space="preserve">Existing AI fairness toolkits — including AI Fairness 360, Fairlearn, and Aequitas — are built for classification problems (loan approvals, hiring decisions, binary predictions). They do not address ranking systems, seller cohorts, or exposure allocation, which are the core constructs of marketplace ranking fairness.</w:t>
+        <w:t xml:space="preserve">Existing AI fairness toolkits — including AI Fairness 360 [4], Fairlearn [5], and Aequitas [6] — are built for classification problems (loan approvals, hiring decisions, binary predictions). They do not address ranking systems, seller cohorts, or exposure allocation, which are the core constructs of marketplace ranking fairness.</w:t>
       </w:r>
     </w:p>
     <w:p>
@@ -657,6 +657,63 @@
       </w:pPr>
       <w:r>
         <w:t xml:space="preserve">Volumes 2 through 6 were originally developed as independent technical artifacts. This overview (Volume 1) and the consistent MRFS naming across all volumes were introduced to present them as a single, cohesive standard rather than a set of separate documents.</w:t>
+      </w:r>
+    </w:p>
+    <w:p>
+      <w:pPr>
+        <w:pStyle w:val="Heading1"/>
+        <w:spacing w:after="160" w:before="280"/>
+      </w:pPr>
+      <w:r>
+        <w:t xml:space="preserve">9. References</w:t>
+      </w:r>
+    </w:p>
+    <w:p>
+      <w:pPr>
+        <w:spacing w:after="120"/>
+      </w:pPr>
+      <w:r>
+        <w:t xml:space="preserve">[1] Sapiezynski, P., Zeng, W., Robertson, R. E., Mislove, A., &amp; Wilson, C. (2019). Quantifying the Impact of User Attention on Fair Group Representation in Ranked Lists. Companion Proceedings of the 2019 World Wide Web Conference (WWW '19), 553–562. https://doi.org/10.1145/3308560.3316824</w:t>
+      </w:r>
+    </w:p>
+    <w:p>
+      <w:pPr>
+        <w:spacing w:after="120"/>
+      </w:pPr>
+      <w:r>
+        <w:t xml:space="preserve">[2] Biega, A. J., Diaz, F., Ekstrand, M. D., &amp; Kohlmeier, S. (2023). Overview of the TREC 2021 Fair Ranking Track. arXiv:2302.10856. https://arxiv.org/abs/2302.10856</w:t>
+      </w:r>
+    </w:p>
+    <w:p>
+      <w:pPr>
+        <w:spacing w:after="120"/>
+      </w:pPr>
+      <w:r>
+        <w:t xml:space="preserve">[3] Tabassi, E. (2023). Artificial Intelligence Risk Management Framework (AI RMF 1.0). NIST AI 100-1. National Institute of Standards and Technology. https://doi.org/10.6028/NIST.AI.100-1</w:t>
+      </w:r>
+    </w:p>
+    <w:p>
+      <w:pPr>
+        <w:spacing w:after="120"/>
+      </w:pPr>
+      <w:r>
+        <w:t xml:space="preserve">[4] Bellamy, R. K. E., Dey, K., Hind, M., Hoffman, S. C., Houde, S., Kannan, K., Lohia, P., Martino, J., Mehta, S., Mojsilović, A., Nagar, S., Ramamurthy, K. N., Richards, J., Saha, D., Sattigeri, P., Singh, M., Varshney, K. R., &amp; Zhang, Y. (2018). AI Fairness 360: An Extensible Toolkit for Detecting, Understanding, and Mitigating Unwanted Algorithmic Bias. arXiv:1810.01943. https://arxiv.org/abs/1810.01943</w:t>
+      </w:r>
+    </w:p>
+    <w:p>
+      <w:pPr>
+        <w:spacing w:after="120"/>
+      </w:pPr>
+      <w:r>
+        <w:t xml:space="preserve">[5] Weerts, H., Dudík, M., Edgar, R., Jalali, A., Lutz, R., &amp; Madaio, M. (2023). Fairlearn: Assessing and Improving Fairness of AI Systems. Journal of Machine Learning Research, 24(257), 1–8. https://arxiv.org/abs/2303.16626</w:t>
+      </w:r>
+    </w:p>
+    <w:p>
+      <w:pPr>
+        <w:spacing w:after="200"/>
+      </w:pPr>
+      <w:r>
+        <w:t xml:space="preserve">[6] Saleiro, P., Kuester, B., Hinkson, L., London, J., Stevens, A., Anisfeld, A., Rodolfa, K. T., &amp; Ghani, R. (2018). Aequitas: A Bias and Fairness Audit Toolkit. arXiv:1811.05577. https://arxiv.org/abs/1811.05577</w:t>
       </w:r>
     </w:p>
     <w:sectPr>

</xml_diff>

<commit_message>
Add missing Ursu citation to Volume 1; add References section + NIST AI RMF/EEOC citations to Volume 3
</commit_message>
<xml_diff>
--- a/docs/volumes/MRFS-Vol1-Standard-Overview.docx
+++ b/docs/volumes/MRFS-Vol1-Standard-Overview.docx
@@ -78,6 +78,14 @@
       </w:pPr>
       <w:r>
         <w:t xml:space="preserve">MRFS is a standard for auditing, governing, and enabling independent oversight of fairness in marketplace ranking and recommendation systems. It defines what to measure, how to measure it repeatably, how findings should be governed and acted on, and what platforms must log to make independent audit possible.</w:t>
+      </w:r>
+    </w:p>
+    <w:p>
+      <w:pPr>
+        <w:spacing w:after="200"/>
+      </w:pPr>
+      <w:r>
+        <w:t xml:space="preserve">These disparities carry direct commercial consequences, not only normative ones: field-experiment evidence from a major online marketplace shows that rank position causally affects consumer search and purchase decisions [7], meaning underexposed sellers bear a measurable revenue cost, not only a fairness one.</w:t>
       </w:r>
     </w:p>
     <w:p>
@@ -714,6 +722,14 @@
       </w:pPr>
       <w:r>
         <w:t xml:space="preserve">[6] Saleiro, P., Kuester, B., Hinkson, L., London, J., Stevens, A., Anisfeld, A., Rodolfa, K. T., &amp; Ghani, R. (2018). Aequitas: A Bias and Fairness Audit Toolkit. arXiv:1811.05577. https://arxiv.org/abs/1811.05577</w:t>
+      </w:r>
+    </w:p>
+    <w:p>
+      <w:pPr>
+        <w:spacing w:after="200"/>
+      </w:pPr>
+      <w:r>
+        <w:t xml:space="preserve">[7] Ursu, R. M. (2018). The Power of Rankings: Quantifying the Effect of Rankings on Online Consumer Search and Purchase Decisions. Marketing Science, 37(4), 530–552. https://doi.org/10.1287/mksc.2017.1072</w:t>
       </w:r>
     </w:p>
     <w:sectPr>

</xml_diff>